<commit_message>
feat: Implement SQuAD data loading with train/validation/test splitting and impossible question filtering, adding scikit-learn dependency.
</commit_message>
<xml_diff>
--- a/Final project.docx
+++ b/Final project.docx
@@ -83,7 +83,7 @@
               </wp:anchor>
             </w:drawing>
           </mc:Choice>
-          <mc:Fallback>
+          <mc:Fallback xmlns="">
             <w:pict>
               <v:line w14:anchorId="125D4DB7" id="Straight Connector 2" o:spid="_x0000_s1026" style="position:absolute;z-index:251659264;visibility:visible;mso-wrap-style:square;mso-wrap-distance-left:9pt;mso-wrap-distance-top:0;mso-wrap-distance-right:9pt;mso-wrap-distance-bottom:0;mso-position-horizontal:absolute;mso-position-horizontal-relative:text;mso-position-vertical:absolute;mso-position-vertical-relative:text" from="9.75pt,13.05pt" to="464.25pt,13.05pt" o:gfxdata="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" strokecolor="black [3213]" strokeweight="3pt">
                 <v:stroke joinstyle="miter"/>
@@ -479,7 +479,7 @@
       <w:r>
         <w:t>As this project requires GPU processing power, Google Colab (</w:t>
       </w:r>
-      <w:hyperlink r:id="rId5" w:history="1">
+      <w:hyperlink r:id="rId8" w:history="1">
         <w:r>
           <w:rPr>
             <w:rStyle w:val="Hyperlink"/>
@@ -754,7 +754,7 @@
       <w:r>
         <w:t xml:space="preserve"> </w:t>
       </w:r>
-      <w:hyperlink r:id="rId6" w:history="1">
+      <w:hyperlink r:id="rId9" w:history="1">
         <w:r>
           <w:rPr>
             <w:rStyle w:val="Hyperlink"/>
@@ -786,7 +786,7 @@
       <w:r>
         <w:t xml:space="preserve"> </w:t>
       </w:r>
-      <w:hyperlink r:id="rId7" w:history="1">
+      <w:hyperlink r:id="rId10" w:history="1">
         <w:r>
           <w:rPr>
             <w:rStyle w:val="Hyperlink"/>
@@ -1098,7 +1098,7 @@
       <w:pPr>
         <w:jc w:val="both"/>
       </w:pPr>
-      <w:hyperlink r:id="rId8" w:history="1">
+      <w:hyperlink r:id="rId11" w:history="1">
         <w:r>
           <w:rPr>
             <w:rStyle w:val="Hyperlink"/>
@@ -1114,7 +1114,7 @@
       <w:r>
         <w:t>provide a training set, and a development (testing) set. The SQuAD website offers 2 columns when exploring the dataset (</w:t>
       </w:r>
-      <w:hyperlink r:id="rId9" w:history="1">
+      <w:hyperlink r:id="rId12" w:history="1">
         <w:r>
           <w:rPr>
             <w:rStyle w:val="Hyperlink"/>
@@ -1159,7 +1159,7 @@
                     </pic:cNvPicPr>
                   </pic:nvPicPr>
                   <pic:blipFill rotWithShape="1">
-                    <a:blip r:embed="rId10">
+                    <a:blip r:embed="rId13">
                       <a:extLst>
                         <a:ext uri="{28A0092B-C50C-407E-A947-70E740481C1C}">
                           <a14:useLocalDpi xmlns:a14="http://schemas.microsoft.com/office/drawing/2010/main" val="0"/>
@@ -1311,7 +1311,7 @@
         <w:rPr>
           <w:noProof/>
         </w:rPr>
-        <w:object w:dxaOrig="9360" w:dyaOrig="9173" w14:anchorId="3DC60C34">
+        <w:object w:dxaOrig="9360" w:dyaOrig="9180" w14:anchorId="6619F634">
           <v:shapetype id="_x0000_t75" coordsize="21600,21600" o:spt="75" o:preferrelative="t" path="m@4@5l@4@11@9@11@9@5xe" filled="f" stroked="f">
             <v:stroke joinstyle="miter"/>
             <v:formulas>
@@ -1331,10 +1331,10 @@
             <v:path o:extrusionok="f" gradientshapeok="t" o:connecttype="rect"/>
             <o:lock v:ext="edit" aspectratio="t"/>
           </v:shapetype>
-          <v:shape id="_x0000_i1025" type="#_x0000_t75" alt="" style="width:468.75pt;height:404.2pt;mso-width-percent:0;mso-height-percent:0;mso-width-percent:0;mso-height-percent:0" o:ole="">
-            <v:imagedata r:id="rId11" o:title=""/>
+          <v:shape id="_x0000_i1025" type="#_x0000_t75" alt="" style="width:468.3pt;height:458.75pt;mso-width-percent:0;mso-height-percent:0;mso-width-percent:0;mso-height-percent:0" o:ole="">
+            <v:imagedata r:id="rId14" o:title=""/>
           </v:shape>
-          <o:OLEObject Type="Embed" ProgID="Word.OpenDocumentText.12" ShapeID="_x0000_i1025" DrawAspect="Content" ObjectID="_1830332595" r:id="rId12"/>
+          <o:OLEObject Type="Embed" ProgID="Word.OpenDocumentText.12" ShapeID="_x0000_i1025" DrawAspect="Content" ObjectID="_1830345845" r:id="rId15"/>
         </w:object>
       </w:r>
     </w:p>
@@ -1653,7 +1653,7 @@
                     </pic:cNvPicPr>
                   </pic:nvPicPr>
                   <pic:blipFill>
-                    <a:blip r:embed="rId13">
+                    <a:blip r:embed="rId16">
                       <a:extLst>
                         <a:ext uri="{28A0092B-C50C-407E-A947-70E740481C1C}">
                           <a14:useLocalDpi xmlns:a14="http://schemas.microsoft.com/office/drawing/2010/main" val="0"/>
@@ -1715,7 +1715,7 @@
       <w:r>
         <w:t>edia. (</w:t>
       </w:r>
-      <w:hyperlink r:id="rId14" w:history="1">
+      <w:hyperlink r:id="rId17" w:history="1">
         <w:r>
           <w:rPr>
             <w:rStyle w:val="Hyperlink"/>
@@ -1736,7 +1736,7 @@
       <w:r>
         <w:t>DBpedia provides multiple ways to query data. One can either download available dataset releases (</w:t>
       </w:r>
-      <w:hyperlink r:id="rId15" w:history="1">
+      <w:hyperlink r:id="rId18" w:history="1">
         <w:r>
           <w:rPr>
             <w:rStyle w:val="Hyperlink"/>
@@ -1747,7 +1747,7 @@
       <w:r>
         <w:t>), run SPARQL queries on the DBpedia public SPARQL endpoint (</w:t>
       </w:r>
-      <w:hyperlink r:id="rId16" w:history="1">
+      <w:hyperlink r:id="rId19" w:history="1">
         <w:r>
           <w:rPr>
             <w:rStyle w:val="Hyperlink"/>
@@ -1761,7 +1761,7 @@
       <w:r>
         <w:t xml:space="preserve"> </w:t>
       </w:r>
-      <w:hyperlink r:id="rId17" w:history="1">
+      <w:hyperlink r:id="rId20" w:history="1">
         <w:r>
           <w:rPr>
             <w:rStyle w:val="Hyperlink"/>
@@ -1772,7 +1772,7 @@
       <w:r>
         <w:t xml:space="preserve">), and linked data access is available in multiple machine-readable formats (JSON for example for Paris: </w:t>
       </w:r>
-      <w:hyperlink r:id="rId18" w:history="1">
+      <w:hyperlink r:id="rId21" w:history="1">
         <w:r>
           <w:rPr>
             <w:rStyle w:val="Hyperlink"/>
@@ -1824,7 +1824,7 @@
                     </pic:cNvPicPr>
                   </pic:nvPicPr>
                   <pic:blipFill rotWithShape="1">
-                    <a:blip r:embed="rId19">
+                    <a:blip r:embed="rId22">
                       <a:extLst>
                         <a:ext uri="{28A0092B-C50C-407E-A947-70E740481C1C}">
                           <a14:useLocalDpi xmlns:a14="http://schemas.microsoft.com/office/drawing/2010/main" val="0"/>
@@ -5440,6 +5440,23 @@
 </file>
 
 <file path=customXml/item1.xml><?xml version="1.0" encoding="utf-8"?>
+<p:properties xmlns:p="http://schemas.microsoft.com/office/2006/metadata/properties" xmlns:xsi="http://www.w3.org/2001/XMLSchema-instance" xmlns:pc="http://schemas.microsoft.com/office/infopath/2007/PartnerControls">
+  <documentManagement>
+    <ReferenceId xmlns="56903b55-3837-4d3c-a189-01cc84031bb5" xsi:nil="true"/>
+  </documentManagement>
+</p:properties>
+</file>
+
+<file path=customXml/item2.xml><?xml version="1.0" encoding="utf-8"?>
+<?mso-contentType ?>
+<FormTemplates xmlns="http://schemas.microsoft.com/sharepoint/v3/contenttype/forms">
+  <Display>DocumentLibraryForm</Display>
+  <Edit>DocumentLibraryForm</Edit>
+  <New>DocumentLibraryForm</New>
+</FormTemplates>
+</file>
+
+<file path=customXml/item3.xml><?xml version="1.0" encoding="utf-8"?>
 <ct:contentTypeSchema xmlns:ct="http://schemas.microsoft.com/office/2006/metadata/contentType" xmlns:ma="http://schemas.microsoft.com/office/2006/metadata/properties/metaAttributes" ct:_="" ma:_="" ma:contentTypeName="Document" ma:contentTypeID="0x010100D601298AD23B674FAB014BADF3317966" ma:contentTypeVersion="1" ma:contentTypeDescription="Create a new document." ma:contentTypeScope="" ma:versionID="78a8c73d04bb12c964eef88e013c06d2">
   <xsd:schema xmlns:xsd="http://www.w3.org/2001/XMLSchema" xmlns:xs="http://www.w3.org/2001/XMLSchema" xmlns:p="http://schemas.microsoft.com/office/2006/metadata/properties" xmlns:ns2="56903b55-3837-4d3c-a189-01cc84031bb5" targetNamespace="http://schemas.microsoft.com/office/2006/metadata/properties" ma:root="true" ma:fieldsID="009c4fd6b7ff08501e1b13d75e4cd6e4" ns2:_="">
     <xsd:import namespace="56903b55-3837-4d3c-a189-01cc84031bb5"/>
@@ -5565,31 +5582,38 @@
 </ct:contentTypeSchema>
 </file>
 
-<file path=customXml/item2.xml><?xml version="1.0" encoding="utf-8"?>
-<?mso-contentType ?>
-<FormTemplates xmlns="http://schemas.microsoft.com/sharepoint/v3/contenttype/forms">
-  <Display>DocumentLibraryForm</Display>
-  <Edit>DocumentLibraryForm</Edit>
-  <New>DocumentLibraryForm</New>
-</FormTemplates>
-</file>
-
-<file path=customXml/item3.xml><?xml version="1.0" encoding="utf-8"?>
-<p:properties xmlns:p="http://schemas.microsoft.com/office/2006/metadata/properties" xmlns:xsi="http://www.w3.org/2001/XMLSchema-instance" xmlns:pc="http://schemas.microsoft.com/office/infopath/2007/PartnerControls">
-  <documentManagement>
-    <ReferenceId xmlns="56903b55-3837-4d3c-a189-01cc84031bb5" xsi:nil="true"/>
-  </documentManagement>
-</p:properties>
-</file>
-
 <file path=customXml/itemProps1.xml><?xml version="1.0" encoding="utf-8"?>
-<ds:datastoreItem xmlns:ds="http://schemas.openxmlformats.org/officeDocument/2006/customXml" ds:itemID="{8CCD441E-DFC2-4AB7-B527-6116719658E0}"/>
+<ds:datastoreItem xmlns:ds="http://schemas.openxmlformats.org/officeDocument/2006/customXml" ds:itemID="{EDC813D8-1BEC-4510-A432-F10134BA3BC7}">
+  <ds:schemaRefs>
+    <ds:schemaRef ds:uri="http://schemas.microsoft.com/office/2006/metadata/properties"/>
+    <ds:schemaRef ds:uri="http://schemas.microsoft.com/office/infopath/2007/PartnerControls"/>
+    <ds:schemaRef ds:uri="56903b55-3837-4d3c-a189-01cc84031bb5"/>
+  </ds:schemaRefs>
+</ds:datastoreItem>
 </file>
 
 <file path=customXml/itemProps2.xml><?xml version="1.0" encoding="utf-8"?>
-<ds:datastoreItem xmlns:ds="http://schemas.openxmlformats.org/officeDocument/2006/customXml" ds:itemID="{3BDC64D0-72CC-4C7A-A140-152AEC5184EA}"/>
+<ds:datastoreItem xmlns:ds="http://schemas.openxmlformats.org/officeDocument/2006/customXml" ds:itemID="{3BDC64D0-72CC-4C7A-A140-152AEC5184EA}">
+  <ds:schemaRefs>
+    <ds:schemaRef ds:uri="http://schemas.microsoft.com/sharepoint/v3/contenttype/forms"/>
+  </ds:schemaRefs>
+</ds:datastoreItem>
 </file>
 
 <file path=customXml/itemProps3.xml><?xml version="1.0" encoding="utf-8"?>
-<ds:datastoreItem xmlns:ds="http://schemas.openxmlformats.org/officeDocument/2006/customXml" ds:itemID="{EDC813D8-1BEC-4510-A432-F10134BA3BC7}"/>
+<ds:datastoreItem xmlns:ds="http://schemas.openxmlformats.org/officeDocument/2006/customXml" ds:itemID="{8CCD441E-DFC2-4AB7-B527-6116719658E0}">
+  <ds:schemaRefs>
+    <ds:schemaRef ds:uri="http://schemas.microsoft.com/office/2006/metadata/contentType"/>
+    <ds:schemaRef ds:uri="http://schemas.microsoft.com/office/2006/metadata/properties/metaAttributes"/>
+    <ds:schemaRef ds:uri="http://www.w3.org/2001/XMLSchema"/>
+    <ds:schemaRef ds:uri="http://schemas.microsoft.com/office/2006/metadata/properties"/>
+    <ds:schemaRef ds:uri="56903b55-3837-4d3c-a189-01cc84031bb5"/>
+    <ds:schemaRef ds:uri="http://schemas.microsoft.com/office/2006/documentManagement/types"/>
+    <ds:schemaRef ds:uri="http://schemas.microsoft.com/office/infopath/2007/PartnerControls"/>
+    <ds:schemaRef ds:uri="http://schemas.openxmlformats.org/package/2006/metadata/core-properties"/>
+    <ds:schemaRef ds:uri="http://purl.org/dc/elements/1.1/"/>
+    <ds:schemaRef ds:uri="http://purl.org/dc/terms/"/>
+    <ds:schemaRef ds:uri="http://schemas.microsoft.com/internal/obd"/>
+  </ds:schemaRefs>
+</ds:datastoreItem>
 </file>
</xml_diff>